<commit_message>
add scaling (isoFLOPs) analysis
</commit_message>
<xml_diff>
--- a/experiments/scaling law.docx
+++ b/experiments/scaling law.docx
@@ -150,12 +150,215 @@
         </w:rPr>
         <w:t>Scaling model size的时候，超参数如何调整</w:t>
       </w:r>
-    </w:p>
-    <w:p/>
-    <w:p/>
-    <w:p>
-      <w:pPr>
-        <w:rPr>
+      <w:r>
+        <w:rPr>
+          <w:rFonts w:hint="eastAsia"/>
+        </w:rPr>
+        <w:t>：</w:t>
+      </w:r>
+    </w:p>
+    <w:p>
+      <w:pPr>
+        <w:pStyle w:val="a9"/>
+        <w:ind w:left="360"/>
+      </w:pPr>
+      <w:r>
+        <w:rPr>
+          <w:rFonts w:hint="eastAsia"/>
+          <w:u w:val="single"/>
+        </w:rPr>
+        <w:t>参考</w:t>
+      </w:r>
+      <w:proofErr w:type="spellStart"/>
+      <w:r>
+        <w:rPr>
+          <w:rFonts w:hint="eastAsia"/>
+          <w:u w:val="single"/>
+        </w:rPr>
+        <w:t>claude</w:t>
+      </w:r>
+      <w:proofErr w:type="spellEnd"/>
+      <w:r>
+        <w:rPr>
+          <w:rFonts w:hint="eastAsia"/>
+          <w:u w:val="single"/>
+        </w:rPr>
+        <w:t>回答</w:t>
+      </w:r>
+      <w:r>
+        <w:rPr>
+          <w:rFonts w:hint="eastAsia"/>
+        </w:rPr>
+        <w:t>：</w:t>
+      </w:r>
+      <w:proofErr w:type="spellStart"/>
+      <w:r>
+        <w:rPr>
+          <w:rFonts w:hint="eastAsia"/>
+        </w:rPr>
+        <w:t>lr</w:t>
+      </w:r>
+      <w:proofErr w:type="spellEnd"/>
+      <w:r>
+        <w:rPr>
+          <w:rFonts w:hint="eastAsia"/>
+        </w:rPr>
+        <w:t>最重要，最好对于每一个model size都进行</w:t>
+      </w:r>
+      <w:proofErr w:type="spellStart"/>
+      <w:r>
+        <w:rPr>
+          <w:rFonts w:hint="eastAsia"/>
+        </w:rPr>
+        <w:t>lr</w:t>
+      </w:r>
+      <w:proofErr w:type="spellEnd"/>
+      <w:r>
+        <w:rPr>
+          <w:rFonts w:hint="eastAsia"/>
+        </w:rPr>
+        <w:t xml:space="preserve"> sweep，或者采用</w:t>
+      </w:r>
+      <w:proofErr w:type="spellStart"/>
+      <w:r>
+        <w:t>μP</w:t>
+      </w:r>
+      <w:proofErr w:type="spellEnd"/>
+      <w:r>
+        <w:t>（Maximal Update Parametrization）</w:t>
+      </w:r>
+    </w:p>
+    <w:p>
+      <w:pPr>
+        <w:pStyle w:val="a9"/>
+        <w:ind w:left="360"/>
+      </w:pPr>
+      <w:r>
+        <w:rPr>
+          <w:rFonts w:hint="eastAsia"/>
+        </w:rPr>
+        <w:t>Lr</w:t>
+      </w:r>
+      <w:r>
+        <w:rPr>
+          <w:rFonts w:hint="eastAsia"/>
+        </w:rPr>
+        <w:t>：</w:t>
+      </w:r>
+      <w:r>
+        <w:rPr>
+          <w:rFonts w:hint="eastAsia"/>
+        </w:rPr>
+        <w:t>采用</w:t>
+      </w:r>
+      <w:r>
+        <w:rPr>
+          <w:rFonts w:hint="eastAsia"/>
+        </w:rPr>
+        <w:t>简便做法</w:t>
+      </w:r>
+      <w:proofErr w:type="spellStart"/>
+      <w:r>
+        <w:rPr>
+          <w:rFonts w:hint="eastAsia"/>
+        </w:rPr>
+        <w:t>lr</w:t>
+      </w:r>
+      <w:proofErr w:type="spellEnd"/>
+      <w:r>
+        <w:rPr>
+          <w:rFonts w:hint="eastAsia"/>
+        </w:rPr>
+        <w:t xml:space="preserve"> = N ^ (-a)，对于63M参数，已经做了</w:t>
+      </w:r>
+      <w:proofErr w:type="spellStart"/>
+      <w:r>
+        <w:rPr>
+          <w:rFonts w:hint="eastAsia"/>
+        </w:rPr>
+        <w:t>lr</w:t>
+      </w:r>
+      <w:proofErr w:type="spellEnd"/>
+      <w:r>
+        <w:rPr>
+          <w:rFonts w:hint="eastAsia"/>
+        </w:rPr>
+        <w:t xml:space="preserve"> sweep得到了最优的</w:t>
+      </w:r>
+      <w:proofErr w:type="spellStart"/>
+      <w:r>
+        <w:rPr>
+          <w:rFonts w:hint="eastAsia"/>
+        </w:rPr>
+        <w:t>lr</w:t>
+      </w:r>
+      <w:proofErr w:type="spellEnd"/>
+      <w:r>
+        <w:rPr>
+          <w:rFonts w:hint="eastAsia"/>
+        </w:rPr>
+        <w:t>，所以可以求得a=0.3。</w:t>
+      </w:r>
+    </w:p>
+    <w:p>
+      <w:pPr>
+        <w:pStyle w:val="a9"/>
+        <w:ind w:left="360"/>
+      </w:pPr>
+      <w:r>
+        <w:rPr>
+          <w:rFonts w:hint="eastAsia"/>
+        </w:rPr>
+        <w:t>Model width/ depth：保持不变</w:t>
+      </w:r>
+    </w:p>
+    <w:p>
+      <w:pPr>
+        <w:pStyle w:val="a9"/>
+        <w:ind w:left="360"/>
+        <w:rPr>
+          <w:rFonts w:hint="eastAsia"/>
+        </w:rPr>
+      </w:pPr>
+      <w:r>
+        <w:rPr>
+          <w:rFonts w:hint="eastAsia"/>
+        </w:rPr>
+        <w:t>其余</w:t>
+      </w:r>
+      <w:proofErr w:type="spellStart"/>
+      <w:r>
+        <w:rPr>
+          <w:rFonts w:hint="eastAsia"/>
+        </w:rPr>
+        <w:t>num_heads</w:t>
+      </w:r>
+      <w:proofErr w:type="spellEnd"/>
+      <w:r>
+        <w:rPr>
+          <w:rFonts w:hint="eastAsia"/>
+        </w:rPr>
+        <w:t>等：参考GPT等模型取值/取中间值</w:t>
+      </w:r>
+    </w:p>
+    <w:p>
+      <w:pPr>
+        <w:rPr>
+          <w:rFonts w:hint="eastAsia"/>
+        </w:rPr>
+      </w:pPr>
+    </w:p>
+    <w:p>
+      <w:pPr>
+        <w:rPr>
+          <w:rFonts w:hint="eastAsia"/>
+        </w:rPr>
+      </w:pPr>
+    </w:p>
+    <w:p>
+      <w:pPr>
+        <w:rPr>
+          <w:rFonts w:hint="eastAsia"/>
           <w:b/>
           <w:bCs/>
         </w:rPr>
@@ -180,6 +383,11 @@
       </w:r>
     </w:p>
     <w:p>
+      <w:pPr>
+        <w:rPr>
+          <w:rFonts w:hint="eastAsia"/>
+        </w:rPr>
+      </w:pPr>
       <w:proofErr w:type="spellStart"/>
       <w:r>
         <w:rPr>
@@ -226,6 +434,11 @@
       </w:r>
     </w:p>
     <w:p>
+      <w:pPr>
+        <w:rPr>
+          <w:rFonts w:hint="eastAsia"/>
+        </w:rPr>
+      </w:pPr>
       <w:r>
         <w:rPr>
           <w:rFonts w:hint="eastAsia"/>
@@ -250,11 +463,6 @@
       </w:pPr>
     </w:p>
     <w:p>
-      <w:pPr>
-        <w:rPr>
-          <w:rFonts w:hint="eastAsia"/>
-        </w:rPr>
-      </w:pPr>
       <w:proofErr w:type="spellStart"/>
       <w:r>
         <w:rPr>
@@ -268,6 +476,52 @@
           <w:rFonts w:hint="eastAsia"/>
         </w:rPr>
         <w:t>: 512</w:t>
+      </w:r>
+    </w:p>
+    <w:p/>
+    <w:p>
+      <w:pPr>
+        <w:rPr>
+          <w:rFonts w:hint="eastAsia"/>
+        </w:rPr>
+      </w:pPr>
+      <w:r>
+        <w:lastRenderedPageBreak/>
+        <w:drawing>
+          <wp:inline distT="0" distB="0" distL="0" distR="0" wp14:anchorId="76DD2759" wp14:editId="26AC6D7D">
+            <wp:extent cx="5274310" cy="4612640"/>
+            <wp:effectExtent l="0" t="0" r="2540" b="0"/>
+            <wp:docPr id="1574350073" name="图片 1"/>
+            <wp:cNvGraphicFramePr>
+              <a:graphicFrameLocks xmlns:a="http://schemas.openxmlformats.org/drawingml/2006/main" noChangeAspect="1"/>
+            </wp:cNvGraphicFramePr>
+            <a:graphic xmlns:a="http://schemas.openxmlformats.org/drawingml/2006/main">
+              <a:graphicData uri="http://schemas.openxmlformats.org/drawingml/2006/picture">
+                <pic:pic xmlns:pic="http://schemas.openxmlformats.org/drawingml/2006/picture">
+                  <pic:nvPicPr>
+                    <pic:cNvPr id="1574350073" name=""/>
+                    <pic:cNvPicPr/>
+                  </pic:nvPicPr>
+                  <pic:blipFill>
+                    <a:blip r:embed="rId7"/>
+                    <a:stretch>
+                      <a:fillRect/>
+                    </a:stretch>
+                  </pic:blipFill>
+                  <pic:spPr>
+                    <a:xfrm>
+                      <a:off x="0" y="0"/>
+                      <a:ext cx="5274310" cy="4612640"/>
+                    </a:xfrm>
+                    <a:prstGeom prst="rect">
+                      <a:avLst/>
+                    </a:prstGeom>
+                  </pic:spPr>
+                </pic:pic>
+              </a:graphicData>
+            </a:graphic>
+          </wp:inline>
+        </w:drawing>
       </w:r>
     </w:p>
     <w:sectPr>

</xml_diff>